<commit_message>
Remove a caixa de aviso do inicio do gabarito
- Sai o retangulo de 'liberar somente depois do fechamento' da primeira pagina,
  junto com os paragrafos vazios que ele deixava. O documento passa a abrir no
  titulo e na secao da inconsistencia plantada
- Framework passa a lembrar por escrito que o gabarito so circula depois do
  fechamento, ja que o aviso nao esta mais impresso no arquivo
</commit_message>
<xml_diff>
--- a/ciclo-de-cases/Gabarito - Case 01 FemVest.docx
+++ b/ciclo-de-cases/Gabarito - Case 01 FemVest.docx
@@ -27,44 +27,6 @@
         </w:rPr>
         <w:t>Semana 1  ·  market entry  ·  material de correção e de estudo</w:t>
       </w:r>
-    </w:p>
-    <w:p>
-      <w:pPr>
-        <w:spacing w:after="140"/>
-      </w:pPr>
-    </w:p>
-    <w:tbl>
-      <w:tblPr>
-        <w:tblStyle w:val="TableGrid"/>
-        <w:tblW w:type="auto" w:w="0"/>
-        <w:tblLook w:firstColumn="1" w:firstRow="1" w:lastColumn="0" w:lastRow="0" w:noHBand="0" w:noVBand="1" w:val="04A0"/>
-      </w:tblPr>
-      <w:tblGrid>
-        <w:gridCol w:w="10426"/>
-      </w:tblGrid>
-      <w:tr>
-        <w:tc>
-          <w:tcPr>
-            <w:tcW w:type="dxa" w:w="9751"/>
-            <w:shd w:val="clear" w:fill="FFF9DB"/>
-          </w:tcPr>
-          <w:p>
-            <w:r>
-              <w:rPr>
-                <w:b/>
-                <w:color w:val="8E0C22"/>
-                <w:sz w:val="18"/>
-              </w:rPr>
-              <w:t>Liberar somente depois do fechamento das entregas, na sexta às 23h59. Antes disso este documento fica só com quem corrige.</w:t>
-            </w:r>
-          </w:p>
-        </w:tc>
-      </w:tr>
-    </w:tbl>
-    <w:p>
-      <w:pPr>
-        <w:spacing w:after="40"/>
-      </w:pPr>
     </w:p>
     <w:p>
       <w:pPr>

</xml_diff>